<commit_message>
Informe del Sprint 5: despliegue en Render en lugar de OCI Compute
</commit_message>
<xml_diff>
--- a/docs/entregables/Informe_PM_Sprint05.docx
+++ b/docs/entregables/Informe_PM_Sprint05.docx
@@ -1702,7 +1702,7 @@
                 <w:sz w:val="19"/>
                 <w:szCs w:val="19"/>
               </w:rPr>
-              <w:t xml:space="preserve">Despliegue en OCI Compute (HU-82, opcional)</w:t>
+              <w:t xml:space="preserve">Despliegue de la aplicación en Render</w:t>
             </w:r>
           </w:p>
         </w:tc>
@@ -1715,7 +1715,7 @@
               <w:bottom w:val="single" w:color="000000" w:sz="4"/>
               <w:right w:val="single" w:color="000000" w:sz="4"/>
             </w:tcBorders>
-            <w:shd w:fill="FFF4D4" w:color="auto" w:val="clear"/>
+            <w:shd w:fill="DCF7EE" w:color="auto" w:val="clear"/>
             <w:tcMar>
               <w:top w:type="dxa" w:w="50"/>
               <w:left w:type="dxa" w:w="90"/>
@@ -1732,7 +1732,7 @@
                 <w:sz w:val="19"/>
                 <w:szCs w:val="19"/>
               </w:rPr>
-              <w:t xml:space="preserve">Parcial</w:t>
+              <w:t xml:space="preserve">Cumplido</w:t>
             </w:r>
           </w:p>
         </w:tc>
@@ -1761,7 +1761,7 @@
                 <w:sz w:val="19"/>
                 <w:szCs w:val="19"/>
               </w:rPr>
-              <w:t xml:space="preserve">Scripts y guía listos; la aplicación corre en Render.</w:t>
+              <w:t xml:space="preserve">En línea en g10-latam-equipo-41-kairos.onrender.com, con la API en /docs.</w:t>
             </w:r>
           </w:p>
         </w:tc>
@@ -3594,7 +3594,7 @@
                 <w:sz w:val="19"/>
                 <w:szCs w:val="19"/>
               </w:rPr>
-              <w:t xml:space="preserve">OCI Compute (opcional)</w:t>
+              <w:t xml:space="preserve">Despliegue de la aplicación</w:t>
             </w:r>
           </w:p>
         </w:tc>
@@ -3607,7 +3607,7 @@
               <w:bottom w:val="single" w:color="000000" w:sz="4"/>
               <w:right w:val="single" w:color="000000" w:sz="4"/>
             </w:tcBorders>
-            <w:shd w:fill="FFF4D4" w:color="auto" w:val="clear"/>
+            <w:shd w:fill="DCF7EE" w:color="auto" w:val="clear"/>
             <w:tcMar>
               <w:top w:type="dxa" w:w="50"/>
               <w:left w:type="dxa" w:w="90"/>
@@ -3624,7 +3624,7 @@
                 <w:sz w:val="19"/>
                 <w:szCs w:val="19"/>
               </w:rPr>
-              <w:t xml:space="preserve">Parcial</w:t>
+              <w:t xml:space="preserve">Cumplido</w:t>
             </w:r>
           </w:p>
         </w:tc>
@@ -3653,7 +3653,7 @@
                 <w:sz w:val="19"/>
                 <w:szCs w:val="19"/>
               </w:rPr>
-              <w:t xml:space="preserve">Scripts listos; desplegado en Render.</w:t>
+              <w:t xml:space="preserve">Render (onrender.com): g10-latam-equipo-41-kairos.onrender.com.</w:t>
             </w:r>
           </w:p>
         </w:tc>
@@ -5605,7 +5605,7 @@
           <w:sz w:val="21"/>
           <w:szCs w:val="21"/>
         </w:rPr>
-        <w:t xml:space="preserve">Mantener Render como servidor de la demo; OCI Compute queda como diferencial opcional.</w:t>
+        <w:t xml:space="preserve">Desplegar la aplicación en Render (onrender.com) para la demo y el Demo Day.</w:t>
       </w:r>
     </w:p>
     <w:p>
@@ -6910,7 +6910,7 @@
                 <w:sz w:val="19"/>
                 <w:szCs w:val="19"/>
               </w:rPr>
-              <w:t xml:space="preserve">HU-82: despliegue en OCI Compute (opcional)</w:t>
+              <w:t xml:space="preserve">Vigilar el servicio en Render: memoria, logs y despliegue automático desde main</w:t>
             </w:r>
           </w:p>
         </w:tc>

</xml_diff>

<commit_message>
Cierre de pendientes del Sprint 5: caché por contenido, variables documentadas, revisión de secretos e historias v3
</commit_message>
<xml_diff>
--- a/docs/entregables/Informe_PM_Sprint05.docx
+++ b/docs/entregables/Informe_PM_Sprint05.docx
@@ -1625,7 +1625,7 @@
               <w:bottom w:val="single" w:color="000000" w:sz="4"/>
               <w:right w:val="single" w:color="000000" w:sz="4"/>
             </w:tcBorders>
-            <w:shd w:fill="FFF4D4" w:color="auto" w:val="clear"/>
+            <w:shd w:fill="DCF7EE" w:color="auto" w:val="clear"/>
             <w:tcMar>
               <w:top w:type="dxa" w:w="50"/>
               <w:left w:type="dxa" w:w="90"/>
@@ -1642,7 +1642,7 @@
                 <w:sz w:val="19"/>
                 <w:szCs w:val="19"/>
               </w:rPr>
-              <w:t xml:space="preserve">Parcial</w:t>
+              <w:t xml:space="preserve">Cumplido</w:t>
             </w:r>
           </w:p>
         </w:tc>
@@ -1671,7 +1671,7 @@
                 <w:sz w:val="19"/>
                 <w:szCs w:val="19"/>
               </w:rPr>
-              <w:t xml:space="preserve">HU-52 pasa a hecha y se agrega HU-100; falta publicar la versión 3.</w:t>
+              <w:t xml:space="preserve">101 historias: 99 hechas y 2 parciales; HU-52 y HU-82 hechas, HU-100 y HU-101 nuevas.</w:t>
             </w:r>
           </w:p>
         </w:tc>
@@ -2237,7 +2237,7 @@
                 <w:sz w:val="19"/>
                 <w:szCs w:val="19"/>
               </w:rPr>
-              <w:t xml:space="preserve">298</w:t>
+              <w:t xml:space="preserve">301</w:t>
             </w:r>
           </w:p>
         </w:tc>
@@ -2266,7 +2266,7 @@
                 <w:sz w:val="19"/>
                 <w:szCs w:val="19"/>
               </w:rPr>
-              <w:t xml:space="preserve">297 pasan; +28 respecto del Sprint 4 (270). Falla 1 prueba del podcast por un cambio en objeto_id.</w:t>
+              <w:t xml:space="preserve">Todas pasan; +31 respecto del Sprint 4 (270). Incluye la revisión de secretos y de .env.example.</w:t>
             </w:r>
           </w:p>
         </w:tc>
@@ -4563,7 +4563,7 @@
                 <w:sz w:val="19"/>
                 <w:szCs w:val="19"/>
               </w:rPr>
-              <w:t xml:space="preserve">Prueba del podcast falla por el cambio en objeto_id</w:t>
+              <w:t xml:space="preserve">Video o podcast viejo al regenerar el mismo material (ruta fija en OCI)</w:t>
             </w:r>
           </w:p>
         </w:tc>
@@ -4592,7 +4592,7 @@
                 <w:sz w:val="19"/>
                 <w:szCs w:val="19"/>
               </w:rPr>
-              <w:t xml:space="preserve">Baja</w:t>
+              <w:t xml:space="preserve">Media</w:t>
             </w:r>
           </w:p>
         </w:tc>
@@ -4605,7 +4605,7 @@
               <w:bottom w:val="single" w:color="000000" w:sz="4"/>
               <w:right w:val="single" w:color="000000" w:sz="4"/>
             </w:tcBorders>
-            <w:shd w:fill="FFE5E5" w:color="auto" w:val="clear"/>
+            <w:shd w:fill="DCF7EE" w:color="auto" w:val="clear"/>
             <w:tcMar>
               <w:top w:type="dxa" w:w="50"/>
               <w:left w:type="dxa" w:w="90"/>
@@ -4622,7 +4622,7 @@
                 <w:sz w:val="19"/>
                 <w:szCs w:val="19"/>
               </w:rPr>
-              <w:t xml:space="preserve">Abierto</w:t>
+              <w:t xml:space="preserve">Resuelto</w:t>
             </w:r>
           </w:p>
         </w:tc>
@@ -4651,7 +4651,7 @@
                 <w:sz w:val="19"/>
                 <w:szCs w:val="19"/>
               </w:rPr>
-              <w:t xml:space="preserve">Ajustar la prueba o devolver el sufijo único.</w:t>
+              <w:t xml:space="preserve">El caché de video y podcast depende también del contenido.</w:t>
             </w:r>
           </w:p>
         </w:tc>
@@ -4680,7 +4680,7 @@
                 <w:sz w:val="19"/>
                 <w:szCs w:val="19"/>
               </w:rPr>
-              <w:t xml:space="preserve">Ethan</w:t>
+              <w:t xml:space="preserve">Juan</w:t>
             </w:r>
           </w:p>
         </w:tc>
@@ -5795,7 +5795,7 @@
           <w:sz w:val="21"/>
           <w:szCs w:val="21"/>
         </w:rPr>
-        <w:t xml:space="preserve">298 pruebas automatizadas y fidelidad 1,00 en la demo con un documento real.</w:t>
+        <w:t xml:space="preserve">301 pruebas automatizadas y fidelidad 1,00 en la demo con un documento real.</w:t>
       </w:r>
     </w:p>
     <w:p>
@@ -6014,9 +6014,9 @@
       </w:tblPr>
       <w:tblGrid>
         <w:gridCol w:w="600"/>
-        <w:gridCol w:w="5400"/>
+        <w:gridCol w:w="5100"/>
         <w:gridCol w:w="2100"/>
-        <w:gridCol w:w="1538"/>
+        <w:gridCol w:w="1838"/>
       </w:tblGrid>
       <w:tr>
         <w:trPr>
@@ -6055,7 +6055,7 @@
         </w:tc>
         <w:tc>
           <w:tcPr>
-            <w:tcW w:type="dxa" w:w="5400"/>
+            <w:tcW w:type="dxa" w:w="5100"/>
             <w:tcBorders>
               <w:top w:val="single" w:color="000000" w:sz="4"/>
               <w:left w:val="single" w:color="000000" w:sz="4"/>
@@ -6117,7 +6117,7 @@
         </w:tc>
         <w:tc>
           <w:tcPr>
-            <w:tcW w:type="dxa" w:w="1538"/>
+            <w:tcW w:type="dxa" w:w="1838"/>
             <w:tcBorders>
               <w:top w:val="single" w:color="000000" w:sz="4"/>
               <w:left w:val="single" w:color="000000" w:sz="4"/>
@@ -6142,7 +6142,7 @@
                 <w:sz w:val="19"/>
                 <w:szCs w:val="19"/>
               </w:rPr>
-              <w:t xml:space="preserve">Prioridad</w:t>
+              <w:t xml:space="preserve">Estado</w:t>
             </w:r>
           </w:p>
         </w:tc>
@@ -6179,7 +6179,7 @@
         </w:tc>
         <w:tc>
           <w:tcPr>
-            <w:tcW w:type="dxa" w:w="5400"/>
+            <w:tcW w:type="dxa" w:w="5100"/>
             <w:tcBorders>
               <w:top w:val="single" w:color="000000" w:sz="4"/>
               <w:left w:val="single" w:color="000000" w:sz="4"/>
@@ -6237,30 +6237,31 @@
         </w:tc>
         <w:tc>
           <w:tcPr>
-            <w:tcW w:type="dxa" w:w="1538"/>
-            <w:tcBorders>
-              <w:top w:val="single" w:color="000000" w:sz="4"/>
-              <w:left w:val="single" w:color="000000" w:sz="4"/>
-              <w:bottom w:val="single" w:color="000000" w:sz="4"/>
-              <w:right w:val="single" w:color="000000" w:sz="4"/>
-            </w:tcBorders>
-            <w:tcMar>
-              <w:top w:type="dxa" w:w="50"/>
-              <w:left w:type="dxa" w:w="90"/>
-              <w:bottom w:type="dxa" w:w="50"/>
-              <w:right w:type="dxa" w:w="90"/>
-            </w:tcMar>
-          </w:tcPr>
-          <w:p>
-            <w:r>
-              <w:rPr>
-                <w:rFonts w:ascii="Arial" w:cs="Arial" w:eastAsia="Arial" w:hAnsi="Arial"/>
-                <w:b w:val="false"/>
-                <w:bCs w:val="false"/>
-                <w:sz w:val="19"/>
-                <w:szCs w:val="19"/>
-              </w:rPr>
-              <w:t xml:space="preserve">Alta</w:t>
+            <w:tcW w:type="dxa" w:w="1838"/>
+            <w:tcBorders>
+              <w:top w:val="single" w:color="000000" w:sz="4"/>
+              <w:left w:val="single" w:color="000000" w:sz="4"/>
+              <w:bottom w:val="single" w:color="000000" w:sz="4"/>
+              <w:right w:val="single" w:color="000000" w:sz="4"/>
+            </w:tcBorders>
+            <w:shd w:fill="FFE5E5" w:color="auto" w:val="clear"/>
+            <w:tcMar>
+              <w:top w:type="dxa" w:w="50"/>
+              <w:left w:type="dxa" w:w="90"/>
+              <w:bottom w:type="dxa" w:w="50"/>
+              <w:right w:type="dxa" w:w="90"/>
+            </w:tcMar>
+          </w:tcPr>
+          <w:p>
+            <w:r>
+              <w:rPr>
+                <w:rFonts w:ascii="Arial" w:cs="Arial" w:eastAsia="Arial" w:hAnsi="Arial"/>
+                <w:b/>
+                <w:bCs/>
+                <w:sz w:val="19"/>
+                <w:szCs w:val="19"/>
+              </w:rPr>
+              <w:t xml:space="preserve">Pendiente (en Render)</w:t>
             </w:r>
           </w:p>
         </w:tc>
@@ -6297,7 +6298,7 @@
         </w:tc>
         <w:tc>
           <w:tcPr>
-            <w:tcW w:type="dxa" w:w="5400"/>
+            <w:tcW w:type="dxa" w:w="5100"/>
             <w:tcBorders>
               <w:top w:val="single" w:color="000000" w:sz="4"/>
               <w:left w:val="single" w:color="000000" w:sz="4"/>
@@ -6355,30 +6356,31 @@
         </w:tc>
         <w:tc>
           <w:tcPr>
-            <w:tcW w:type="dxa" w:w="1538"/>
-            <w:tcBorders>
-              <w:top w:val="single" w:color="000000" w:sz="4"/>
-              <w:left w:val="single" w:color="000000" w:sz="4"/>
-              <w:bottom w:val="single" w:color="000000" w:sz="4"/>
-              <w:right w:val="single" w:color="000000" w:sz="4"/>
-            </w:tcBorders>
-            <w:tcMar>
-              <w:top w:type="dxa" w:w="50"/>
-              <w:left w:type="dxa" w:w="90"/>
-              <w:bottom w:type="dxa" w:w="50"/>
-              <w:right w:type="dxa" w:w="90"/>
-            </w:tcMar>
-          </w:tcPr>
-          <w:p>
-            <w:r>
-              <w:rPr>
-                <w:rFonts w:ascii="Arial" w:cs="Arial" w:eastAsia="Arial" w:hAnsi="Arial"/>
-                <w:b w:val="false"/>
-                <w:bCs w:val="false"/>
-                <w:sz w:val="19"/>
-                <w:szCs w:val="19"/>
-              </w:rPr>
-              <w:t xml:space="preserve">Alta</w:t>
+            <w:tcW w:type="dxa" w:w="1838"/>
+            <w:tcBorders>
+              <w:top w:val="single" w:color="000000" w:sz="4"/>
+              <w:left w:val="single" w:color="000000" w:sz="4"/>
+              <w:bottom w:val="single" w:color="000000" w:sz="4"/>
+              <w:right w:val="single" w:color="000000" w:sz="4"/>
+            </w:tcBorders>
+            <w:shd w:fill="FFE5E5" w:color="auto" w:val="clear"/>
+            <w:tcMar>
+              <w:top w:type="dxa" w:w="50"/>
+              <w:left w:type="dxa" w:w="90"/>
+              <w:bottom w:type="dxa" w:w="50"/>
+              <w:right w:type="dxa" w:w="90"/>
+            </w:tcMar>
+          </w:tcPr>
+          <w:p>
+            <w:r>
+              <w:rPr>
+                <w:rFonts w:ascii="Arial" w:cs="Arial" w:eastAsia="Arial" w:hAnsi="Arial"/>
+                <w:b/>
+                <w:bCs/>
+                <w:sz w:val="19"/>
+                <w:szCs w:val="19"/>
+              </w:rPr>
+              <w:t xml:space="preserve">Pendiente (en OCI)</w:t>
             </w:r>
           </w:p>
         </w:tc>
@@ -6415,30 +6417,30 @@
         </w:tc>
         <w:tc>
           <w:tcPr>
-            <w:tcW w:type="dxa" w:w="5400"/>
-            <w:tcBorders>
-              <w:top w:val="single" w:color="000000" w:sz="4"/>
-              <w:left w:val="single" w:color="000000" w:sz="4"/>
-              <w:bottom w:val="single" w:color="000000" w:sz="4"/>
-              <w:right w:val="single" w:color="000000" w:sz="4"/>
-            </w:tcBorders>
-            <w:tcMar>
-              <w:top w:type="dxa" w:w="50"/>
-              <w:left w:type="dxa" w:w="90"/>
-              <w:bottom w:type="dxa" w:w="50"/>
-              <w:right w:type="dxa" w:w="90"/>
-            </w:tcMar>
-          </w:tcPr>
-          <w:p>
-            <w:r>
-              <w:rPr>
-                <w:rFonts w:ascii="Arial" w:cs="Arial" w:eastAsia="Arial" w:hAnsi="Arial"/>
-                <w:b w:val="false"/>
-                <w:bCs w:val="false"/>
-                <w:sz w:val="19"/>
-                <w:szCs w:val="19"/>
-              </w:rPr>
-              <w:t xml:space="preserve">Corregir la prueba del podcast (objeto_id)</w:t>
+            <w:tcW w:type="dxa" w:w="5100"/>
+            <w:tcBorders>
+              <w:top w:val="single" w:color="000000" w:sz="4"/>
+              <w:left w:val="single" w:color="000000" w:sz="4"/>
+              <w:bottom w:val="single" w:color="000000" w:sz="4"/>
+              <w:right w:val="single" w:color="000000" w:sz="4"/>
+            </w:tcBorders>
+            <w:tcMar>
+              <w:top w:type="dxa" w:w="50"/>
+              <w:left w:type="dxa" w:w="90"/>
+              <w:bottom w:type="dxa" w:w="50"/>
+              <w:right w:type="dxa" w:w="90"/>
+            </w:tcMar>
+          </w:tcPr>
+          <w:p>
+            <w:r>
+              <w:rPr>
+                <w:rFonts w:ascii="Arial" w:cs="Arial" w:eastAsia="Arial" w:hAnsi="Arial"/>
+                <w:b w:val="false"/>
+                <w:bCs w:val="false"/>
+                <w:sz w:val="19"/>
+                <w:szCs w:val="19"/>
+              </w:rPr>
+              <w:t xml:space="preserve">Corregir la prueba del podcast: el caché ahora depende del contenido</w:t>
             </w:r>
           </w:p>
         </w:tc>
@@ -6467,36 +6469,37 @@
                 <w:sz w:val="19"/>
                 <w:szCs w:val="19"/>
               </w:rPr>
-              <w:t xml:space="preserve">Ethan</w:t>
-            </w:r>
-          </w:p>
-        </w:tc>
-        <w:tc>
-          <w:tcPr>
-            <w:tcW w:type="dxa" w:w="1538"/>
-            <w:tcBorders>
-              <w:top w:val="single" w:color="000000" w:sz="4"/>
-              <w:left w:val="single" w:color="000000" w:sz="4"/>
-              <w:bottom w:val="single" w:color="000000" w:sz="4"/>
-              <w:right w:val="single" w:color="000000" w:sz="4"/>
-            </w:tcBorders>
-            <w:tcMar>
-              <w:top w:type="dxa" w:w="50"/>
-              <w:left w:type="dxa" w:w="90"/>
-              <w:bottom w:type="dxa" w:w="50"/>
-              <w:right w:type="dxa" w:w="90"/>
-            </w:tcMar>
-          </w:tcPr>
-          <w:p>
-            <w:r>
-              <w:rPr>
-                <w:rFonts w:ascii="Arial" w:cs="Arial" w:eastAsia="Arial" w:hAnsi="Arial"/>
-                <w:b w:val="false"/>
-                <w:bCs w:val="false"/>
-                <w:sz w:val="19"/>
-                <w:szCs w:val="19"/>
-              </w:rPr>
-              <w:t xml:space="preserve">Media</w:t>
+              <w:t xml:space="preserve">Juan</w:t>
+            </w:r>
+          </w:p>
+        </w:tc>
+        <w:tc>
+          <w:tcPr>
+            <w:tcW w:type="dxa" w:w="1838"/>
+            <w:tcBorders>
+              <w:top w:val="single" w:color="000000" w:sz="4"/>
+              <w:left w:val="single" w:color="000000" w:sz="4"/>
+              <w:bottom w:val="single" w:color="000000" w:sz="4"/>
+              <w:right w:val="single" w:color="000000" w:sz="4"/>
+            </w:tcBorders>
+            <w:shd w:fill="DCF7EE" w:color="auto" w:val="clear"/>
+            <w:tcMar>
+              <w:top w:type="dxa" w:w="50"/>
+              <w:left w:type="dxa" w:w="90"/>
+              <w:bottom w:type="dxa" w:w="50"/>
+              <w:right w:type="dxa" w:w="90"/>
+            </w:tcMar>
+          </w:tcPr>
+          <w:p>
+            <w:r>
+              <w:rPr>
+                <w:rFonts w:ascii="Arial" w:cs="Arial" w:eastAsia="Arial" w:hAnsi="Arial"/>
+                <w:b/>
+                <w:bCs/>
+                <w:sz w:val="19"/>
+                <w:szCs w:val="19"/>
+              </w:rPr>
+              <w:t xml:space="preserve">Hecho</w:t>
             </w:r>
           </w:p>
         </w:tc>
@@ -6533,30 +6536,30 @@
         </w:tc>
         <w:tc>
           <w:tcPr>
-            <w:tcW w:type="dxa" w:w="5400"/>
-            <w:tcBorders>
-              <w:top w:val="single" w:color="000000" w:sz="4"/>
-              <w:left w:val="single" w:color="000000" w:sz="4"/>
-              <w:bottom w:val="single" w:color="000000" w:sz="4"/>
-              <w:right w:val="single" w:color="000000" w:sz="4"/>
-            </w:tcBorders>
-            <w:tcMar>
-              <w:top w:type="dxa" w:w="50"/>
-              <w:left w:type="dxa" w:w="90"/>
-              <w:bottom w:type="dxa" w:w="50"/>
-              <w:right w:type="dxa" w:w="90"/>
-            </w:tcMar>
-          </w:tcPr>
-          <w:p>
-            <w:r>
-              <w:rPr>
-                <w:rFonts w:ascii="Arial" w:cs="Arial" w:eastAsia="Arial" w:hAnsi="Arial"/>
-                <w:b w:val="false"/>
-                <w:bCs w:val="false"/>
-                <w:sz w:val="19"/>
-                <w:szCs w:val="19"/>
-              </w:rPr>
-              <w:t xml:space="preserve">Publicar las historias de usuario v3 (HU-52 hecha, HU-100 nueva)</w:t>
+            <w:tcW w:type="dxa" w:w="5100"/>
+            <w:tcBorders>
+              <w:top w:val="single" w:color="000000" w:sz="4"/>
+              <w:left w:val="single" w:color="000000" w:sz="4"/>
+              <w:bottom w:val="single" w:color="000000" w:sz="4"/>
+              <w:right w:val="single" w:color="000000" w:sz="4"/>
+            </w:tcBorders>
+            <w:tcMar>
+              <w:top w:type="dxa" w:w="50"/>
+              <w:left w:type="dxa" w:w="90"/>
+              <w:bottom w:type="dxa" w:w="50"/>
+              <w:right w:type="dxa" w:w="90"/>
+            </w:tcMar>
+          </w:tcPr>
+          <w:p>
+            <w:r>
+              <w:rPr>
+                <w:rFonts w:ascii="Arial" w:cs="Arial" w:eastAsia="Arial" w:hAnsi="Arial"/>
+                <w:b w:val="false"/>
+                <w:bCs w:val="false"/>
+                <w:sz w:val="19"/>
+                <w:szCs w:val="19"/>
+              </w:rPr>
+              <w:t xml:space="preserve">Publicar las historias de usuario v3 (101 historias)</w:t>
             </w:r>
           </w:p>
         </w:tc>
@@ -6585,36 +6588,37 @@
                 <w:sz w:val="19"/>
                 <w:szCs w:val="19"/>
               </w:rPr>
-              <w:t xml:space="preserve">Juan / Diana</w:t>
-            </w:r>
-          </w:p>
-        </w:tc>
-        <w:tc>
-          <w:tcPr>
-            <w:tcW w:type="dxa" w:w="1538"/>
-            <w:tcBorders>
-              <w:top w:val="single" w:color="000000" w:sz="4"/>
-              <w:left w:val="single" w:color="000000" w:sz="4"/>
-              <w:bottom w:val="single" w:color="000000" w:sz="4"/>
-              <w:right w:val="single" w:color="000000" w:sz="4"/>
-            </w:tcBorders>
-            <w:tcMar>
-              <w:top w:type="dxa" w:w="50"/>
-              <w:left w:type="dxa" w:w="90"/>
-              <w:bottom w:type="dxa" w:w="50"/>
-              <w:right w:type="dxa" w:w="90"/>
-            </w:tcMar>
-          </w:tcPr>
-          <w:p>
-            <w:r>
-              <w:rPr>
-                <w:rFonts w:ascii="Arial" w:cs="Arial" w:eastAsia="Arial" w:hAnsi="Arial"/>
-                <w:b w:val="false"/>
-                <w:bCs w:val="false"/>
-                <w:sz w:val="19"/>
-                <w:szCs w:val="19"/>
-              </w:rPr>
-              <w:t xml:space="preserve">Media</w:t>
+              <w:t xml:space="preserve">Juan</w:t>
+            </w:r>
+          </w:p>
+        </w:tc>
+        <w:tc>
+          <w:tcPr>
+            <w:tcW w:type="dxa" w:w="1838"/>
+            <w:tcBorders>
+              <w:top w:val="single" w:color="000000" w:sz="4"/>
+              <w:left w:val="single" w:color="000000" w:sz="4"/>
+              <w:bottom w:val="single" w:color="000000" w:sz="4"/>
+              <w:right w:val="single" w:color="000000" w:sz="4"/>
+            </w:tcBorders>
+            <w:shd w:fill="DCF7EE" w:color="auto" w:val="clear"/>
+            <w:tcMar>
+              <w:top w:type="dxa" w:w="50"/>
+              <w:left w:type="dxa" w:w="90"/>
+              <w:bottom w:type="dxa" w:w="50"/>
+              <w:right w:type="dxa" w:w="90"/>
+            </w:tcMar>
+          </w:tcPr>
+          <w:p>
+            <w:r>
+              <w:rPr>
+                <w:rFonts w:ascii="Arial" w:cs="Arial" w:eastAsia="Arial" w:hAnsi="Arial"/>
+                <w:b/>
+                <w:bCs/>
+                <w:sz w:val="19"/>
+                <w:szCs w:val="19"/>
+              </w:rPr>
+              <w:t xml:space="preserve">Hecho</w:t>
             </w:r>
           </w:p>
         </w:tc>
@@ -6651,30 +6655,30 @@
         </w:tc>
         <w:tc>
           <w:tcPr>
-            <w:tcW w:type="dxa" w:w="5400"/>
-            <w:tcBorders>
-              <w:top w:val="single" w:color="000000" w:sz="4"/>
-              <w:left w:val="single" w:color="000000" w:sz="4"/>
-              <w:bottom w:val="single" w:color="000000" w:sz="4"/>
-              <w:right w:val="single" w:color="000000" w:sz="4"/>
-            </w:tcBorders>
-            <w:tcMar>
-              <w:top w:type="dxa" w:w="50"/>
-              <w:left w:type="dxa" w:w="90"/>
-              <w:bottom w:type="dxa" w:w="50"/>
-              <w:right w:type="dxa" w:w="90"/>
-            </w:tcMar>
-          </w:tcPr>
-          <w:p>
-            <w:r>
-              <w:rPr>
-                <w:rFonts w:ascii="Arial" w:cs="Arial" w:eastAsia="Arial" w:hAnsi="Arial"/>
-                <w:b w:val="false"/>
-                <w:bCs w:val="false"/>
-                <w:sz w:val="19"/>
-                <w:szCs w:val="19"/>
-              </w:rPr>
-              <w:t xml:space="preserve">Documentar en .env.example las variables nuevas de IA y voz</w:t>
+            <w:tcW w:type="dxa" w:w="5100"/>
+            <w:tcBorders>
+              <w:top w:val="single" w:color="000000" w:sz="4"/>
+              <w:left w:val="single" w:color="000000" w:sz="4"/>
+              <w:bottom w:val="single" w:color="000000" w:sz="4"/>
+              <w:right w:val="single" w:color="000000" w:sz="4"/>
+            </w:tcBorders>
+            <w:tcMar>
+              <w:top w:type="dxa" w:w="50"/>
+              <w:left w:type="dxa" w:w="90"/>
+              <w:bottom w:type="dxa" w:w="50"/>
+              <w:right w:type="dxa" w:w="90"/>
+            </w:tcMar>
+          </w:tcPr>
+          <w:p>
+            <w:r>
+              <w:rPr>
+                <w:rFonts w:ascii="Arial" w:cs="Arial" w:eastAsia="Arial" w:hAnsi="Arial"/>
+                <w:b w:val="false"/>
+                <w:bCs w:val="false"/>
+                <w:sz w:val="19"/>
+                <w:szCs w:val="19"/>
+              </w:rPr>
+              <w:t xml:space="preserve">Documentar en .env.example las variables nuevas de IA y voz, con prueba</w:t>
             </w:r>
           </w:p>
         </w:tc>
@@ -6703,36 +6707,37 @@
                 <w:sz w:val="19"/>
                 <w:szCs w:val="19"/>
               </w:rPr>
-              <w:t xml:space="preserve">Ethan</w:t>
-            </w:r>
-          </w:p>
-        </w:tc>
-        <w:tc>
-          <w:tcPr>
-            <w:tcW w:type="dxa" w:w="1538"/>
-            <w:tcBorders>
-              <w:top w:val="single" w:color="000000" w:sz="4"/>
-              <w:left w:val="single" w:color="000000" w:sz="4"/>
-              <w:bottom w:val="single" w:color="000000" w:sz="4"/>
-              <w:right w:val="single" w:color="000000" w:sz="4"/>
-            </w:tcBorders>
-            <w:tcMar>
-              <w:top w:type="dxa" w:w="50"/>
-              <w:left w:type="dxa" w:w="90"/>
-              <w:bottom w:type="dxa" w:w="50"/>
-              <w:right w:type="dxa" w:w="90"/>
-            </w:tcMar>
-          </w:tcPr>
-          <w:p>
-            <w:r>
-              <w:rPr>
-                <w:rFonts w:ascii="Arial" w:cs="Arial" w:eastAsia="Arial" w:hAnsi="Arial"/>
-                <w:b w:val="false"/>
-                <w:bCs w:val="false"/>
-                <w:sz w:val="19"/>
-                <w:szCs w:val="19"/>
-              </w:rPr>
-              <w:t xml:space="preserve">Media</w:t>
+              <w:t xml:space="preserve">Juan</w:t>
+            </w:r>
+          </w:p>
+        </w:tc>
+        <w:tc>
+          <w:tcPr>
+            <w:tcW w:type="dxa" w:w="1838"/>
+            <w:tcBorders>
+              <w:top w:val="single" w:color="000000" w:sz="4"/>
+              <w:left w:val="single" w:color="000000" w:sz="4"/>
+              <w:bottom w:val="single" w:color="000000" w:sz="4"/>
+              <w:right w:val="single" w:color="000000" w:sz="4"/>
+            </w:tcBorders>
+            <w:shd w:fill="DCF7EE" w:color="auto" w:val="clear"/>
+            <w:tcMar>
+              <w:top w:type="dxa" w:w="50"/>
+              <w:left w:type="dxa" w:w="90"/>
+              <w:bottom w:type="dxa" w:w="50"/>
+              <w:right w:type="dxa" w:w="90"/>
+            </w:tcMar>
+          </w:tcPr>
+          <w:p>
+            <w:r>
+              <w:rPr>
+                <w:rFonts w:ascii="Arial" w:cs="Arial" w:eastAsia="Arial" w:hAnsi="Arial"/>
+                <w:b/>
+                <w:bCs/>
+                <w:sz w:val="19"/>
+                <w:szCs w:val="19"/>
+              </w:rPr>
+              <w:t xml:space="preserve">Hecho</w:t>
             </w:r>
           </w:p>
         </w:tc>
@@ -6769,30 +6774,30 @@
         </w:tc>
         <w:tc>
           <w:tcPr>
-            <w:tcW w:type="dxa" w:w="5400"/>
-            <w:tcBorders>
-              <w:top w:val="single" w:color="000000" w:sz="4"/>
-              <w:left w:val="single" w:color="000000" w:sz="4"/>
-              <w:bottom w:val="single" w:color="000000" w:sz="4"/>
-              <w:right w:val="single" w:color="000000" w:sz="4"/>
-            </w:tcBorders>
-            <w:tcMar>
-              <w:top w:type="dxa" w:w="50"/>
-              <w:left w:type="dxa" w:w="90"/>
-              <w:bottom w:type="dxa" w:w="50"/>
-              <w:right w:type="dxa" w:w="90"/>
-            </w:tcMar>
-          </w:tcPr>
-          <w:p>
-            <w:r>
-              <w:rPr>
-                <w:rFonts w:ascii="Arial" w:cs="Arial" w:eastAsia="Arial" w:hAnsi="Arial"/>
-                <w:b w:val="false"/>
-                <w:bCs w:val="false"/>
-                <w:sz w:val="19"/>
-                <w:szCs w:val="19"/>
-              </w:rPr>
-              <w:t xml:space="preserve">Agregar revisión automática de secretos antes de subir</w:t>
+            <w:tcW w:type="dxa" w:w="5100"/>
+            <w:tcBorders>
+              <w:top w:val="single" w:color="000000" w:sz="4"/>
+              <w:left w:val="single" w:color="000000" w:sz="4"/>
+              <w:bottom w:val="single" w:color="000000" w:sz="4"/>
+              <w:right w:val="single" w:color="000000" w:sz="4"/>
+            </w:tcBorders>
+            <w:tcMar>
+              <w:top w:type="dxa" w:w="50"/>
+              <w:left w:type="dxa" w:w="90"/>
+              <w:bottom w:type="dxa" w:w="50"/>
+              <w:right w:type="dxa" w:w="90"/>
+            </w:tcMar>
+          </w:tcPr>
+          <w:p>
+            <w:r>
+              <w:rPr>
+                <w:rFonts w:ascii="Arial" w:cs="Arial" w:eastAsia="Arial" w:hAnsi="Arial"/>
+                <w:b w:val="false"/>
+                <w:bCs w:val="false"/>
+                <w:sz w:val="19"/>
+                <w:szCs w:val="19"/>
+              </w:rPr>
+              <w:t xml:space="preserve">Revisión de secretos antes de cada commit y en GitHub Actions</w:t>
             </w:r>
           </w:p>
         </w:tc>
@@ -6827,30 +6832,31 @@
         </w:tc>
         <w:tc>
           <w:tcPr>
-            <w:tcW w:type="dxa" w:w="1538"/>
-            <w:tcBorders>
-              <w:top w:val="single" w:color="000000" w:sz="4"/>
-              <w:left w:val="single" w:color="000000" w:sz="4"/>
-              <w:bottom w:val="single" w:color="000000" w:sz="4"/>
-              <w:right w:val="single" w:color="000000" w:sz="4"/>
-            </w:tcBorders>
-            <w:tcMar>
-              <w:top w:type="dxa" w:w="50"/>
-              <w:left w:type="dxa" w:w="90"/>
-              <w:bottom w:type="dxa" w:w="50"/>
-              <w:right w:type="dxa" w:w="90"/>
-            </w:tcMar>
-          </w:tcPr>
-          <w:p>
-            <w:r>
-              <w:rPr>
-                <w:rFonts w:ascii="Arial" w:cs="Arial" w:eastAsia="Arial" w:hAnsi="Arial"/>
-                <w:b w:val="false"/>
-                <w:bCs w:val="false"/>
-                <w:sz w:val="19"/>
-                <w:szCs w:val="19"/>
-              </w:rPr>
-              <w:t xml:space="preserve">Baja</w:t>
+            <w:tcW w:type="dxa" w:w="1838"/>
+            <w:tcBorders>
+              <w:top w:val="single" w:color="000000" w:sz="4"/>
+              <w:left w:val="single" w:color="000000" w:sz="4"/>
+              <w:bottom w:val="single" w:color="000000" w:sz="4"/>
+              <w:right w:val="single" w:color="000000" w:sz="4"/>
+            </w:tcBorders>
+            <w:shd w:fill="DCF7EE" w:color="auto" w:val="clear"/>
+            <w:tcMar>
+              <w:top w:type="dxa" w:w="50"/>
+              <w:left w:type="dxa" w:w="90"/>
+              <w:bottom w:type="dxa" w:w="50"/>
+              <w:right w:type="dxa" w:w="90"/>
+            </w:tcMar>
+          </w:tcPr>
+          <w:p>
+            <w:r>
+              <w:rPr>
+                <w:rFonts w:ascii="Arial" w:cs="Arial" w:eastAsia="Arial" w:hAnsi="Arial"/>
+                <w:b/>
+                <w:bCs/>
+                <w:sz w:val="19"/>
+                <w:szCs w:val="19"/>
+              </w:rPr>
+              <w:t xml:space="preserve">Hecho</w:t>
             </w:r>
           </w:p>
         </w:tc>
@@ -6887,30 +6893,30 @@
         </w:tc>
         <w:tc>
           <w:tcPr>
-            <w:tcW w:type="dxa" w:w="5400"/>
-            <w:tcBorders>
-              <w:top w:val="single" w:color="000000" w:sz="4"/>
-              <w:left w:val="single" w:color="000000" w:sz="4"/>
-              <w:bottom w:val="single" w:color="000000" w:sz="4"/>
-              <w:right w:val="single" w:color="000000" w:sz="4"/>
-            </w:tcBorders>
-            <w:tcMar>
-              <w:top w:type="dxa" w:w="50"/>
-              <w:left w:type="dxa" w:w="90"/>
-              <w:bottom w:type="dxa" w:w="50"/>
-              <w:right w:type="dxa" w:w="90"/>
-            </w:tcMar>
-          </w:tcPr>
-          <w:p>
-            <w:r>
-              <w:rPr>
-                <w:rFonts w:ascii="Arial" w:cs="Arial" w:eastAsia="Arial" w:hAnsi="Arial"/>
-                <w:b w:val="false"/>
-                <w:bCs w:val="false"/>
-                <w:sz w:val="19"/>
-                <w:szCs w:val="19"/>
-              </w:rPr>
-              <w:t xml:space="preserve">Vigilar el servicio en Render: memoria, logs y despliegue automático desde main</w:t>
+            <w:tcW w:type="dxa" w:w="5100"/>
+            <w:tcBorders>
+              <w:top w:val="single" w:color="000000" w:sz="4"/>
+              <w:left w:val="single" w:color="000000" w:sz="4"/>
+              <w:bottom w:val="single" w:color="000000" w:sz="4"/>
+              <w:right w:val="single" w:color="000000" w:sz="4"/>
+            </w:tcBorders>
+            <w:tcMar>
+              <w:top w:type="dxa" w:w="50"/>
+              <w:left w:type="dxa" w:w="90"/>
+              <w:bottom w:type="dxa" w:w="50"/>
+              <w:right w:type="dxa" w:w="90"/>
+            </w:tcMar>
+          </w:tcPr>
+          <w:p>
+            <w:r>
+              <w:rPr>
+                <w:rFonts w:ascii="Arial" w:cs="Arial" w:eastAsia="Arial" w:hAnsi="Arial"/>
+                <w:b w:val="false"/>
+                <w:bCs w:val="false"/>
+                <w:sz w:val="19"/>
+                <w:szCs w:val="19"/>
+              </w:rPr>
+              <w:t xml:space="preserve">Vigilar el servicio en Render: memoria, logs y despliegue desde main</w:t>
             </w:r>
           </w:p>
         </w:tc>
@@ -6945,30 +6951,31 @@
         </w:tc>
         <w:tc>
           <w:tcPr>
-            <w:tcW w:type="dxa" w:w="1538"/>
-            <w:tcBorders>
-              <w:top w:val="single" w:color="000000" w:sz="4"/>
-              <w:left w:val="single" w:color="000000" w:sz="4"/>
-              <w:bottom w:val="single" w:color="000000" w:sz="4"/>
-              <w:right w:val="single" w:color="000000" w:sz="4"/>
-            </w:tcBorders>
-            <w:tcMar>
-              <w:top w:type="dxa" w:w="50"/>
-              <w:left w:type="dxa" w:w="90"/>
-              <w:bottom w:type="dxa" w:w="50"/>
-              <w:right w:type="dxa" w:w="90"/>
-            </w:tcMar>
-          </w:tcPr>
-          <w:p>
-            <w:r>
-              <w:rPr>
-                <w:rFonts w:ascii="Arial" w:cs="Arial" w:eastAsia="Arial" w:hAnsi="Arial"/>
-                <w:b w:val="false"/>
-                <w:bCs w:val="false"/>
-                <w:sz w:val="19"/>
-                <w:szCs w:val="19"/>
-              </w:rPr>
-              <w:t xml:space="preserve">Baja</w:t>
+            <w:tcW w:type="dxa" w:w="1838"/>
+            <w:tcBorders>
+              <w:top w:val="single" w:color="000000" w:sz="4"/>
+              <w:left w:val="single" w:color="000000" w:sz="4"/>
+              <w:bottom w:val="single" w:color="000000" w:sz="4"/>
+              <w:right w:val="single" w:color="000000" w:sz="4"/>
+            </w:tcBorders>
+            <w:shd w:fill="FFF4D4" w:color="auto" w:val="clear"/>
+            <w:tcMar>
+              <w:top w:type="dxa" w:w="50"/>
+              <w:left w:type="dxa" w:w="90"/>
+              <w:bottom w:type="dxa" w:w="50"/>
+              <w:right w:type="dxa" w:w="90"/>
+            </w:tcMar>
+          </w:tcPr>
+          <w:p>
+            <w:r>
+              <w:rPr>
+                <w:rFonts w:ascii="Arial" w:cs="Arial" w:eastAsia="Arial" w:hAnsi="Arial"/>
+                <w:b/>
+                <w:bCs/>
+                <w:sz w:val="19"/>
+                <w:szCs w:val="19"/>
+              </w:rPr>
+              <w:t xml:space="preserve">En curso</w:t>
             </w:r>
           </w:p>
         </w:tc>

</xml_diff>

<commit_message>
Informe del PM del Sprint 5 actualizado con el cierre de pendientes
</commit_message>
<xml_diff>
--- a/docs/entregables/Informe_PM_Sprint05.docx
+++ b/docs/entregables/Informe_PM_Sprint05.docx
@@ -641,6 +641,19 @@
           <w:sz w:val="21"/>
           <w:szCs w:val="21"/>
         </w:rPr>
+        <w:t xml:space="preserve">Al cierre se resolvieron los pendientes técnicos: el caché de video y podcast ahora depende del contenido (evita entregar un audio viejo al regenerar un material), se documentaron en .env.example todas las variables de IA y voz, se agregó una revisión de secretos antes de cada commit y en GitHub Actions, y se publicaron las historias de usuario v3 (101 historias: 99 hechas y 2 parciales). Las 301 pruebas automatizadas pasan.</w:t>
+      </w:r>
+    </w:p>
+    <w:p>
+      <w:pPr>
+        <w:spacing w:after="120" w:line="276"/>
+      </w:pPr>
+      <w:r>
+        <w:rPr>
+          <w:rFonts w:ascii="Arial" w:cs="Arial" w:eastAsia="Arial" w:hAnsi="Arial"/>
+          <w:sz w:val="21"/>
+          <w:szCs w:val="21"/>
+        </w:rPr>
         <w:t xml:space="preserve">El estado es verde: el MVP cumple los requisitos obligatorios. Quedan observaciones: el servidor de Render debe desplegar los últimos commits, la cuota gratuita de voz puede agotarse durante la demo y una llave privada de OCI quedó en el historial de ramas antiguas y debe revocarse.</w:t>
       </w:r>
     </w:p>
@@ -1535,7 +1548,7 @@
               <w:bottom w:val="single" w:color="000000" w:sz="4"/>
               <w:right w:val="single" w:color="000000" w:sz="4"/>
             </w:tcBorders>
-            <w:shd w:fill="DCF7EE" w:color="auto" w:val="clear"/>
+            <w:shd w:fill="FFF4D4" w:color="auto" w:val="clear"/>
             <w:tcMar>
               <w:top w:type="dxa" w:w="50"/>
               <w:left w:type="dxa" w:w="90"/>
@@ -1552,7 +1565,7 @@
                 <w:sz w:val="19"/>
                 <w:szCs w:val="19"/>
               </w:rPr>
-              <w:t xml:space="preserve">Cumplido</w:t>
+              <w:t xml:space="preserve">Parcial</w:t>
             </w:r>
           </w:p>
         </w:tc>
@@ -1581,7 +1594,7 @@
                 <w:sz w:val="19"/>
                 <w:szCs w:val="19"/>
               </w:rPr>
-              <w:t xml:space="preserve">PR #37 fusionado; este informe incluye la retrospectiva.</w:t>
+              <w:t xml:space="preserve">Informe y retrospectiva listos; PR #30 a #37 fusionados; falta fusionar el PR final con los cambios de cierre.</w:t>
             </w:r>
           </w:p>
         </w:tc>
@@ -2047,7 +2060,96 @@
           <w:sz w:val="21"/>
           <w:szCs w:val="21"/>
         </w:rPr>
-        <w:t xml:space="preserve">Pull requests integrados a main: #29 a #37.</w:t>
+        <w:t xml:space="preserve">Historias de usuario v3: 101 historias en 15 épicas (99 hechas y 2 parciales).</w:t>
+      </w:r>
+    </w:p>
+    <w:p>
+      <w:pPr>
+        <w:pStyle w:val="ListParagraph"/>
+        <w:numPr>
+          <w:ilvl w:val="0"/>
+          <w:numId w:val="2"/>
+        </w:numPr>
+        <w:spacing w:after="60"/>
+      </w:pPr>
+      <w:r>
+        <w:rPr>
+          <w:rFonts w:ascii="Arial" w:cs="Arial" w:eastAsia="Arial" w:hAnsi="Arial"/>
+          <w:sz w:val="21"/>
+          <w:szCs w:val="21"/>
+        </w:rPr>
+        <w:t xml:space="preserve">Pull requests integrados a main: #29 a #37; el PR final de cierre está pendiente de fusionar.</w:t>
+      </w:r>
+    </w:p>
+    <w:p>
+      <w:pPr>
+        <w:pStyle w:val="Heading2"/>
+        <w:spacing w:after="80" w:before="180"/>
+      </w:pPr>
+      <w:r>
+        <w:rPr>
+          <w:rFonts w:ascii="Arial" w:cs="Arial" w:eastAsia="Arial" w:hAnsi="Arial"/>
+          <w:b/>
+          <w:bCs/>
+          <w:color w:val="2B2440"/>
+          <w:sz w:val="22"/>
+          <w:szCs w:val="22"/>
+        </w:rPr>
+        <w:t xml:space="preserve">Calidad y seguridad</w:t>
+      </w:r>
+    </w:p>
+    <w:p>
+      <w:pPr>
+        <w:pStyle w:val="ListParagraph"/>
+        <w:numPr>
+          <w:ilvl w:val="0"/>
+          <w:numId w:val="2"/>
+        </w:numPr>
+        <w:spacing w:after="60"/>
+      </w:pPr>
+      <w:r>
+        <w:rPr>
+          <w:rFonts w:ascii="Arial" w:cs="Arial" w:eastAsia="Arial" w:hAnsi="Arial"/>
+          <w:sz w:val="21"/>
+          <w:szCs w:val="21"/>
+        </w:rPr>
+        <w:t xml:space="preserve">El caché de video y podcast depende del contenido: al regenerar un material no se entrega el audio anterior.</w:t>
+      </w:r>
+    </w:p>
+    <w:p>
+      <w:pPr>
+        <w:pStyle w:val="ListParagraph"/>
+        <w:numPr>
+          <w:ilvl w:val="0"/>
+          <w:numId w:val="2"/>
+        </w:numPr>
+        <w:spacing w:after="60"/>
+      </w:pPr>
+      <w:r>
+        <w:rPr>
+          <w:rFonts w:ascii="Arial" w:cs="Arial" w:eastAsia="Arial" w:hAnsi="Arial"/>
+          <w:sz w:val="21"/>
+          <w:szCs w:val="21"/>
+        </w:rPr>
+        <w:t xml:space="preserve">Todas las variables de entorno documentadas en .env.example, con una prueba que avisa si falta alguna.</w:t>
+      </w:r>
+    </w:p>
+    <w:p>
+      <w:pPr>
+        <w:pStyle w:val="ListParagraph"/>
+        <w:numPr>
+          <w:ilvl w:val="0"/>
+          <w:numId w:val="2"/>
+        </w:numPr>
+        <w:spacing w:after="60"/>
+      </w:pPr>
+      <w:r>
+        <w:rPr>
+          <w:rFonts w:ascii="Arial" w:cs="Arial" w:eastAsia="Arial" w:hAnsi="Arial"/>
+          <w:sz w:val="21"/>
+          <w:szCs w:val="21"/>
+        </w:rPr>
+        <w:t xml:space="preserve">Revisión de secretos (scripts/revisar_secretos.py) antes de cada commit y en GitHub Actions, junto con las pruebas.</w:t>
       </w:r>
     </w:p>
     <w:p>
@@ -2742,7 +2844,7 @@
                 <w:sz w:val="19"/>
                 <w:szCs w:val="19"/>
               </w:rPr>
-              <w:t xml:space="preserve">Commits en main del sprint</w:t>
+              <w:t xml:space="preserve">Commits del sprint</w:t>
             </w:r>
           </w:p>
         </w:tc>
@@ -2771,7 +2873,7 @@
                 <w:sz w:val="19"/>
                 <w:szCs w:val="19"/>
               </w:rPr>
-              <w:t xml:space="preserve">36</w:t>
+              <w:t xml:space="preserve">39</w:t>
             </w:r>
           </w:p>
         </w:tc>
@@ -2800,7 +2902,7 @@
                 <w:sz w:val="19"/>
                 <w:szCs w:val="19"/>
               </w:rPr>
-              <w:t xml:space="preserve">Juan 19 · Diana 11 · Darío 4 · Ethan 2.</w:t>
+              <w:t xml:space="preserve">Juan 22 · Diana 11 · Darío 4 · Ethan 2 (rama SPRINT05).</w:t>
             </w:r>
           </w:p>
         </w:tc>
@@ -5211,7 +5313,7 @@
                 <w:sz w:val="19"/>
                 <w:szCs w:val="19"/>
               </w:rPr>
-              <w:t xml:space="preserve">Versión 1.5, README, OCI en Render, logo, audio del video, botón Cancelar, documentación, speech del Demo Day y gestión de ramas.</w:t>
+              <w:t xml:space="preserve">Versión 1.5, README, OCI en Render, logo, audio del video, botón Cancelar, caché por contenido, revisión de secretos, historias v3, documentación, speech del Demo Day y gestión de ramas.</w:t>
             </w:r>
           </w:p>
         </w:tc>
@@ -7008,7 +7110,7 @@
           <w:sz w:val="21"/>
           <w:szCs w:val="21"/>
         </w:rPr>
-        <w:t xml:space="preserve">Con el Sprint 5 termina el plan de cinco sprints del hackathon (21 de septiembre al 25 de octubre de 2026). La rama SPRINT05 quedó integrada a main por el PR #37 y ambas ramas apuntan al mismo commit. NuevaMente llega al Demo Day con los requisitos obligatorios cumplidos, la aplicación desplegada, la documentación completa y la retrospectiva registrada.</w:t>
+        <w:t xml:space="preserve">Con el Sprint 5 termina el plan de cinco sprints del hackathon (21 de septiembre al 25 de octubre de 2026). La rama SPRINT05 se integró a main por los PR #30 a #37, y los cambios de cierre (este informe, las historias v3 y la revisión de secretos) llegan a main con el PR final. NuevaMente llega al Demo Day con los requisitos obligatorios cumplidos, la aplicación desplegada, la documentación completa y la retrospectiva registrada.</w:t>
       </w:r>
     </w:p>
     <w:p>

</xml_diff>

<commit_message>
Informe del PM del Sprint 5 con el código sin pendientes
</commit_message>
<xml_diff>
--- a/docs/entregables/Informe_PM_Sprint05.docx
+++ b/docs/entregables/Informe_PM_Sprint05.docx
@@ -641,7 +641,7 @@
           <w:sz w:val="21"/>
           <w:szCs w:val="21"/>
         </w:rPr>
-        <w:t xml:space="preserve">Al cierre se resolvieron los pendientes técnicos: el caché de video y podcast ahora depende del contenido (evita entregar un audio viejo al regenerar un material), se documentaron en .env.example todas las variables de IA y voz, se agregó una revisión de secretos antes de cada commit y en GitHub Actions, y se publicaron las historias de usuario v3 (101 historias: 99 hechas y 2 parciales). Las 301 pruebas automatizadas pasan.</w:t>
+        <w:t xml:space="preserve">Al cierre se resolvieron los pendientes técnicos: el caché de video y podcast ahora depende del contenido (evita entregar un audio viejo al regenerar un material), se documentaron en .env.example todas las variables de IA y voz, se agregó una revisión de secretos antes de cada commit y en GitHub Actions, y se publicaron las historias de usuario v3 (101 historias: 99 hechas y 2 parciales). Además se integró el PR #38 de Ethan (pruebas de la API y respaldo local visible) y se reconocen los títulos numerados con guion («1 - Objetivos»). Las 315 pruebas automatizadas pasan y el código queda sin historias pendientes.</w:t>
       </w:r>
     </w:p>
     <w:p>
@@ -1684,7 +1684,7 @@
                 <w:sz w:val="19"/>
                 <w:szCs w:val="19"/>
               </w:rPr>
-              <w:t xml:space="preserve">101 historias: 99 hechas y 2 parciales; HU-52 y HU-82 hechas, HU-100 y HU-101 nuevas.</w:t>
+              <w:t xml:space="preserve">101 historias: 100 hechas y 1 parcial (HU-83, se confirma en la consola de OCI); HU-100 y HU-101 nuevas.</w:t>
             </w:r>
           </w:p>
         </w:tc>
@@ -2060,7 +2060,25 @@
           <w:sz w:val="21"/>
           <w:szCs w:val="21"/>
         </w:rPr>
-        <w:t xml:space="preserve">Historias de usuario v3: 101 historias en 15 épicas (99 hechas y 2 parciales).</w:t>
+        <w:t xml:space="preserve">Historias de usuario v3: 101 historias en 15 épicas (100 hechas y 1 parcial que depende de la cuenta de OCI).</w:t>
+      </w:r>
+    </w:p>
+    <w:p>
+      <w:pPr>
+        <w:pStyle w:val="ListParagraph"/>
+        <w:numPr>
+          <w:ilvl w:val="0"/>
+          <w:numId w:val="2"/>
+        </w:numPr>
+        <w:spacing w:after="60"/>
+      </w:pPr>
+      <w:r>
+        <w:rPr>
+          <w:rFonts w:ascii="Arial" w:cs="Arial" w:eastAsia="Arial" w:hAnsi="Arial"/>
+          <w:sz w:val="21"/>
+          <w:szCs w:val="21"/>
+        </w:rPr>
+        <w:t xml:space="preserve">Títulos numerados con guion o raya («1 - Objetivos») reconocidos en texto plano, PDF y Markdown.</w:t>
       </w:r>
     </w:p>
     <w:p>
@@ -2339,7 +2357,7 @@
                 <w:sz w:val="19"/>
                 <w:szCs w:val="19"/>
               </w:rPr>
-              <w:t xml:space="preserve">301</w:t>
+              <w:t xml:space="preserve">315</w:t>
             </w:r>
           </w:p>
         </w:tc>
@@ -2368,7 +2386,7 @@
                 <w:sz w:val="19"/>
                 <w:szCs w:val="19"/>
               </w:rPr>
-              <w:t xml:space="preserve">Todas pasan; +31 respecto del Sprint 4 (270). Incluye la revisión de secretos y de .env.example.</w:t>
+              <w:t xml:space="preserve">Todas pasan; +45 respecto del Sprint 4 (270). Incluye las pruebas de Ethan (PR #38), la revisión de secretos y .env.example.</w:t>
             </w:r>
           </w:p>
         </w:tc>
@@ -2784,7 +2802,7 @@
                 <w:sz w:val="19"/>
                 <w:szCs w:val="19"/>
               </w:rPr>
-              <w:t xml:space="preserve">9</w:t>
+              <w:t xml:space="preserve">10</w:t>
             </w:r>
           </w:p>
         </w:tc>
@@ -2813,7 +2831,7 @@
                 <w:sz w:val="19"/>
                 <w:szCs w:val="19"/>
               </w:rPr>
-              <w:t xml:space="preserve">#29 a #37; #38 (Ethan) abierto.</w:t>
+              <w:t xml:space="preserve">#29 a #37 en main; #38 (Ethan) integrado en SPRINT05.</w:t>
             </w:r>
           </w:p>
         </w:tc>
@@ -2873,7 +2891,7 @@
                 <w:sz w:val="19"/>
                 <w:szCs w:val="19"/>
               </w:rPr>
-              <w:t xml:space="preserve">39</w:t>
+              <w:t xml:space="preserve">45</w:t>
             </w:r>
           </w:p>
         </w:tc>
@@ -2902,7 +2920,7 @@
                 <w:sz w:val="19"/>
                 <w:szCs w:val="19"/>
               </w:rPr>
-              <w:t xml:space="preserve">Juan 22 · Diana 11 · Darío 4 · Ethan 2 (rama SPRINT05).</w:t>
+              <w:t xml:space="preserve">Juan 26 · Diana 11 · Ethan 4 · Darío 4 (rama SPRINT05).</w:t>
             </w:r>
           </w:p>
         </w:tc>
@@ -5402,7 +5420,7 @@
                 <w:sz w:val="19"/>
                 <w:szCs w:val="19"/>
               </w:rPr>
-              <w:t xml:space="preserve">Rutas de guardado en OCI (HU-52) y corrección del error 401 y del namespace (PR #36).</w:t>
+              <w:t xml:space="preserve">Rutas de guardado en OCI (HU-52), corrección del error 401 y del namespace (PR #36), y pruebas de la API y respaldo local visible (PR #38).</w:t>
             </w:r>
           </w:p>
         </w:tc>
@@ -5897,7 +5915,7 @@
           <w:sz w:val="21"/>
           <w:szCs w:val="21"/>
         </w:rPr>
-        <w:t xml:space="preserve">301 pruebas automatizadas y fidelidad 1,00 en la demo con un documento real.</w:t>
+        <w:t xml:space="preserve">315 pruebas automatizadas y fidelidad 1,00 en la demo con un documento real.</w:t>
       </w:r>
     </w:p>
     <w:p>

</xml_diff>

<commit_message>
Cierre del Sprint 5: informe final y main lista para el deploy
</commit_message>
<xml_diff>
--- a/docs/entregables/Informe_PM_Sprint05.docx
+++ b/docs/entregables/Informe_PM_Sprint05.docx
@@ -628,7 +628,7 @@
           <w:sz w:val="21"/>
           <w:szCs w:val="21"/>
         </w:rPr>
-        <w:t xml:space="preserve">Diana Dure cargó en Jira las actividades del Sprint 5 y las evidencias de pruebas; Darío Higuera dejó la instalación local con Docker Compose y la clave de OCI. Se entregaron la documentación del proyecto (TAREA_01), el speech final del Demo Day en Word y una solicitud JSON de ejemplo con un documento de normas de conducta, que demuestra el uso en varios sectores además de Salud.</w:t>
+        <w:t xml:space="preserve">Diana Dure cargó en Jira las actividades del Sprint 5, los casos de prueba de las historias y la documentación del Sprint 1; Darío Higuera dejó la instalación local con Docker Compose y la clave de OCI. Se entregaron la documentación del proyecto (TAREA_01), el speech final del Demo Day en Word y una solicitud JSON de ejemplo con un documento de normas de conducta, que demuestra el uso en varios sectores además de Salud.</w:t>
       </w:r>
     </w:p>
     <w:p>
@@ -1548,7 +1548,7 @@
               <w:bottom w:val="single" w:color="000000" w:sz="4"/>
               <w:right w:val="single" w:color="000000" w:sz="4"/>
             </w:tcBorders>
-            <w:shd w:fill="FFF4D4" w:color="auto" w:val="clear"/>
+            <w:shd w:fill="DCF7EE" w:color="auto" w:val="clear"/>
             <w:tcMar>
               <w:top w:type="dxa" w:w="50"/>
               <w:left w:type="dxa" w:w="90"/>
@@ -1565,7 +1565,7 @@
                 <w:sz w:val="19"/>
                 <w:szCs w:val="19"/>
               </w:rPr>
-              <w:t xml:space="preserve">Parcial</w:t>
+              <w:t xml:space="preserve">Cumplido</w:t>
             </w:r>
           </w:p>
         </w:tc>
@@ -1594,7 +1594,7 @@
                 <w:sz w:val="19"/>
                 <w:szCs w:val="19"/>
               </w:rPr>
-              <w:t xml:space="preserve">Informe y retrospectiva listos; PR #30 a #37 fusionados; falta fusionar el PR final con los cambios de cierre.</w:t>
+              <w:t xml:space="preserve">PR #39 y #40 fusionados; este informe incluye la retrospectiva; el último commit de cierre se integra a main para el deploy.</w:t>
             </w:r>
           </w:p>
         </w:tc>
@@ -2096,7 +2096,7 @@
           <w:sz w:val="21"/>
           <w:szCs w:val="21"/>
         </w:rPr>
-        <w:t xml:space="preserve">Pull requests integrados a main: #29 a #37; el PR final de cierre está pendiente de fusionar.</w:t>
+        <w:t xml:space="preserve">Pull requests integrados a main: #29 a #37, #39 y #40; el PR #38 de Ethan llega a main a través de SPRINT05.</w:t>
       </w:r>
     </w:p>
     <w:p>
@@ -2802,7 +2802,7 @@
                 <w:sz w:val="19"/>
                 <w:szCs w:val="19"/>
               </w:rPr>
-              <w:t xml:space="preserve">10</w:t>
+              <w:t xml:space="preserve">12</w:t>
             </w:r>
           </w:p>
         </w:tc>
@@ -2831,7 +2831,7 @@
                 <w:sz w:val="19"/>
                 <w:szCs w:val="19"/>
               </w:rPr>
-              <w:t xml:space="preserve">#29 a #37 en main; #38 (Ethan) integrado en SPRINT05.</w:t>
+              <w:t xml:space="preserve">#29 a #37, #39 y #40 en main; #38 (Ethan) integrado en SPRINT05.</w:t>
             </w:r>
           </w:p>
         </w:tc>
@@ -2891,7 +2891,7 @@
                 <w:sz w:val="19"/>
                 <w:szCs w:val="19"/>
               </w:rPr>
-              <w:t xml:space="preserve">45</w:t>
+              <w:t xml:space="preserve">50</w:t>
             </w:r>
           </w:p>
         </w:tc>
@@ -2920,7 +2920,7 @@
                 <w:sz w:val="19"/>
                 <w:szCs w:val="19"/>
               </w:rPr>
-              <w:t xml:space="preserve">Juan 26 · Diana 11 · Ethan 4 · Darío 4 (rama SPRINT05).</w:t>
+              <w:t xml:space="preserve">Juan 27 · Diana 15 · Ethan 4 · Darío 4.</w:t>
             </w:r>
           </w:p>
         </w:tc>
@@ -5598,7 +5598,7 @@
                 <w:sz w:val="19"/>
                 <w:szCs w:val="19"/>
               </w:rPr>
-              <w:t xml:space="preserve">Actividades del Sprint 5 en Jira, evidencias de pruebas y actualización del README.</w:t>
+              <w:t xml:space="preserve">Actividades del Sprint 5 en Jira, casos de prueba por historia, documentación del Sprint 1, evidencias de pruebas y README de Jira.</w:t>
             </w:r>
           </w:p>
         </w:tc>
@@ -7128,7 +7128,7 @@
           <w:sz w:val="21"/>
           <w:szCs w:val="21"/>
         </w:rPr>
-        <w:t xml:space="preserve">Con el Sprint 5 termina el plan de cinco sprints del hackathon (21 de septiembre al 25 de octubre de 2026). La rama SPRINT05 se integró a main por los PR #30 a #37, y los cambios de cierre (este informe, las historias v3 y la revisión de secretos) llegan a main con el PR final. NuevaMente llega al Demo Day con los requisitos obligatorios cumplidos, la aplicación desplegada, la documentación completa y la retrospectiva registrada.</w:t>
+        <w:t xml:space="preserve">Con el Sprint 5 termina el plan de cinco sprints del hackathon (21 de septiembre al 25 de octubre de 2026). La rama SPRINT05 se integró a main por los PR #30 a #40, y el último commit de cierre deja main y SPRINT05 iguales, listas para desplegar en Render. NuevaMente llega al Demo Day con los requisitos obligatorios cumplidos, la aplicación desplegada, la documentación completa y la retrospectiva registrada.</w:t>
       </w:r>
     </w:p>
     <w:p>

</xml_diff>

<commit_message>
Informe del Sprint 5: estado del despliegue en Render
</commit_message>
<xml_diff>
--- a/docs/entregables/Informe_PM_Sprint05.docx
+++ b/docs/entregables/Informe_PM_Sprint05.docx
@@ -654,7 +654,7 @@
           <w:sz w:val="21"/>
           <w:szCs w:val="21"/>
         </w:rPr>
-        <w:t xml:space="preserve">El estado es verde: el MVP cumple los requisitos obligatorios. Quedan observaciones: el servidor de Render debe desplegar los últimos commits, la cuota gratuita de voz puede agotarse durante la demo y una llave privada de OCI quedó en el historial de ramas antiguas y debe revocarse.</w:t>
+        <w:t xml:space="preserve">El estado es verde: el MVP cumple los requisitos obligatorios. La aplicación en Render responde con la versión 1.5, OCI activo y el botón Cancelar publicado. Quedan observaciones: Render debe desplegar el último commit de cierre, la cuota gratuita de voz puede agotarse durante la demo y una llave privada de OCI quedó en el historial de ramas antiguas y debe revocarse.</w:t>
       </w:r>
     </w:p>
     <w:p>
@@ -1774,7 +1774,7 @@
                 <w:sz w:val="19"/>
                 <w:szCs w:val="19"/>
               </w:rPr>
-              <w:t xml:space="preserve">En línea en g10-latam-equipo-41-kairos.onrender.com, con la API en /docs.</w:t>
+              <w:t xml:space="preserve">En línea en g10-latam-equipo-41-kairos.onrender.com: /health responde ok, versión 1.5 y oci_disponible: true.</w:t>
             </w:r>
           </w:p>
         </w:tc>
@@ -2742,7 +2742,7 @@
                 <w:sz w:val="19"/>
                 <w:szCs w:val="19"/>
               </w:rPr>
-              <w:t xml:space="preserve">Visible en el pie de la interfaz y en /health.</w:t>
+              <w:t xml:space="preserve">En Render: /health ok, oci_disponible: true; botón Cancelar y logo en línea (27/10).</w:t>
             </w:r>
           </w:p>
         </w:tc>
@@ -4091,7 +4091,7 @@
                 <w:sz w:val="19"/>
                 <w:szCs w:val="19"/>
               </w:rPr>
-              <w:t xml:space="preserve">Render no despliega los últimos commits de main</w:t>
+              <w:t xml:space="preserve">Render sin el último commit de cierre (falta, por ejemplo, «sectores» en /opciones)</w:t>
             </w:r>
           </w:p>
         </w:tc>
@@ -4120,7 +4120,7 @@
                 <w:sz w:val="19"/>
                 <w:szCs w:val="19"/>
               </w:rPr>
-              <w:t xml:space="preserve">Alta</w:t>
+              <w:t xml:space="preserve">Media</w:t>
             </w:r>
           </w:p>
         </w:tc>
@@ -4133,7 +4133,7 @@
               <w:bottom w:val="single" w:color="000000" w:sz="4"/>
               <w:right w:val="single" w:color="000000" w:sz="4"/>
             </w:tcBorders>
-            <w:shd w:fill="FFE5E5" w:color="auto" w:val="clear"/>
+            <w:shd w:fill="FFF4D4" w:color="auto" w:val="clear"/>
             <w:tcMar>
               <w:top w:type="dxa" w:w="50"/>
               <w:left w:type="dxa" w:w="90"/>
@@ -4150,7 +4150,7 @@
                 <w:sz w:val="19"/>
                 <w:szCs w:val="19"/>
               </w:rPr>
-              <w:t xml:space="preserve">Abierto</w:t>
+              <w:t xml:space="preserve">Mitigado</w:t>
             </w:r>
           </w:p>
         </w:tc>
@@ -4179,7 +4179,7 @@
                 <w:sz w:val="19"/>
                 <w:szCs w:val="19"/>
               </w:rPr>
-              <w:t xml:space="preserve">Manual Deploy → Deploy latest commit y revisar Events y Logs.</w:t>
+              <w:t xml:space="preserve">Render ya publica la v1.5 con OCI y el botón Cancelar; falta Manual Deploy → Deploy latest commit (3fd4079).</w:t>
             </w:r>
           </w:p>
         </w:tc>
@@ -6322,7 +6322,7 @@
                 <w:sz w:val="19"/>
                 <w:szCs w:val="19"/>
               </w:rPr>
-              <w:t xml:space="preserve">Desplegar el último commit en Render y comprobar video con audio</w:t>
+              <w:t xml:space="preserve">Desplegar el último commit (3fd4079) en Render y comprobar video con audio</w:t>
             </w:r>
           </w:p>
         </w:tc>
@@ -6364,7 +6364,7 @@
               <w:bottom w:val="single" w:color="000000" w:sz="4"/>
               <w:right w:val="single" w:color="000000" w:sz="4"/>
             </w:tcBorders>
-            <w:shd w:fill="FFE5E5" w:color="auto" w:val="clear"/>
+            <w:shd w:fill="FFF4D4" w:color="auto" w:val="clear"/>
             <w:tcMar>
               <w:top w:type="dxa" w:w="50"/>
               <w:left w:type="dxa" w:w="90"/>
@@ -6381,7 +6381,7 @@
                 <w:sz w:val="19"/>
                 <w:szCs w:val="19"/>
               </w:rPr>
-              <w:t xml:space="preserve">Pendiente (en Render)</w:t>
+              <w:t xml:space="preserve">En curso</w:t>
             </w:r>
           </w:p>
         </w:tc>

</xml_diff>